<commit_message>
számlák áthelyezése az admin oldalból a számla fülhöz
</commit_message>
<xml_diff>
--- a/dokumentacio_modern_v2.docx
+++ b/dokumentacio_modern_v2.docx
@@ -60,48 +60,12 @@
         <w:br w:type="page"/>
       </w:r>
     </w:p>
+    <w:p/>
     <w:p>
       <w:pPr>
         <w:pStyle w:val="Cmsor1"/>
       </w:pPr>
       <w:r>
-        <w:lastRenderedPageBreak/>
-        <w:t>Tartalomjegyzék</w:t>
-      </w:r>
-    </w:p>
-    <w:p>
-      <w:r>
-        <w:fldChar w:fldCharType="begin"/>
-      </w:r>
-      <w:r>
-        <w:instrText>TOC \o "1-3" \h \z \u</w:instrText>
-      </w:r>
-      <w:r>
-        <w:fldChar w:fldCharType="separate"/>
-      </w:r>
-      <w:r>
-        <w:fldChar w:fldCharType="end"/>
-      </w:r>
-    </w:p>
-    <w:p>
-      <w:pPr>
-        <w:pStyle w:val="Note"/>
-      </w:pPr>
-      <w:r>
-        <w:t>Megjegyzés: Word-ben a tartalomjegyzék frissítéséhez jobb klikk → Mező frissítése (vagy F9).</w:t>
-      </w:r>
-    </w:p>
-    <w:p>
-      <w:r>
-        <w:br w:type="page"/>
-      </w:r>
-    </w:p>
-    <w:p>
-      <w:pPr>
-        <w:pStyle w:val="Cmsor1"/>
-      </w:pPr>
-      <w:r>
-        <w:lastRenderedPageBreak/>
         <w:t>1. Projekt összefoglaló</w:t>
       </w:r>
     </w:p>
@@ -1085,9 +1049,15 @@
             <w:vAlign w:val="center"/>
           </w:tcPr>
           <w:p>
+            <w:pPr>
+              <w:rPr>
+                <w:sz w:val="20"/>
+              </w:rPr>
+            </w:pPr>
             <w:r>
               <w:rPr>
                 <w:b/>
+                <w:sz w:val="20"/>
               </w:rPr>
               <w:t>Tábla</w:t>
             </w:r>
@@ -1100,9 +1070,15 @@
             <w:vAlign w:val="center"/>
           </w:tcPr>
           <w:p>
+            <w:pPr>
+              <w:rPr>
+                <w:sz w:val="20"/>
+              </w:rPr>
+            </w:pPr>
             <w:r>
               <w:rPr>
                 <w:b/>
+                <w:sz w:val="20"/>
               </w:rPr>
               <w:t>Oszlopok</w:t>
             </w:r>
@@ -1115,9 +1091,15 @@
             <w:vAlign w:val="center"/>
           </w:tcPr>
           <w:p>
+            <w:pPr>
+              <w:rPr>
+                <w:sz w:val="20"/>
+              </w:rPr>
+            </w:pPr>
             <w:r>
               <w:rPr>
                 <w:b/>
+                <w:sz w:val="20"/>
               </w:rPr>
               <w:t>FK kapcsolatok</w:t>
             </w:r>
@@ -1130,7 +1112,15 @@
             <w:tcW w:w="2551" w:type="dxa"/>
           </w:tcPr>
           <w:p>
-            <w:r>
+            <w:pPr>
+              <w:rPr>
+                <w:sz w:val="20"/>
+              </w:rPr>
+            </w:pPr>
+            <w:r>
+              <w:rPr>
+                <w:sz w:val="20"/>
+              </w:rPr>
               <w:t>anyagok</w:t>
             </w:r>
           </w:p>
@@ -1140,7 +1130,15 @@
             <w:tcW w:w="1247" w:type="dxa"/>
           </w:tcPr>
           <w:p>
-            <w:r>
+            <w:pPr>
+              <w:rPr>
+                <w:sz w:val="20"/>
+              </w:rPr>
+            </w:pPr>
+            <w:r>
+              <w:rPr>
+                <w:sz w:val="20"/>
+              </w:rPr>
               <w:t>3</w:t>
             </w:r>
           </w:p>
@@ -1150,7 +1148,15 @@
             <w:tcW w:w="5556" w:type="dxa"/>
           </w:tcPr>
           <w:p>
-            <w:r>
+            <w:pPr>
+              <w:rPr>
+                <w:sz w:val="20"/>
+              </w:rPr>
+            </w:pPr>
+            <w:r>
+              <w:rPr>
+                <w:sz w:val="20"/>
+              </w:rPr>
               <w:t>—</w:t>
             </w:r>
           </w:p>
@@ -1162,7 +1168,15 @@
             <w:tcW w:w="2551" w:type="dxa"/>
           </w:tcPr>
           <w:p>
-            <w:r>
+            <w:pPr>
+              <w:rPr>
+                <w:sz w:val="20"/>
+              </w:rPr>
+            </w:pPr>
+            <w:r>
+              <w:rPr>
+                <w:sz w:val="20"/>
+              </w:rPr>
               <w:t>fizetesi_mod</w:t>
             </w:r>
           </w:p>
@@ -1172,7 +1186,15 @@
             <w:tcW w:w="1247" w:type="dxa"/>
           </w:tcPr>
           <w:p>
-            <w:r>
+            <w:pPr>
+              <w:rPr>
+                <w:sz w:val="20"/>
+              </w:rPr>
+            </w:pPr>
+            <w:r>
+              <w:rPr>
+                <w:sz w:val="20"/>
+              </w:rPr>
               <w:t>2</w:t>
             </w:r>
           </w:p>
@@ -1182,7 +1204,15 @@
             <w:tcW w:w="5556" w:type="dxa"/>
           </w:tcPr>
           <w:p>
-            <w:r>
+            <w:pPr>
+              <w:rPr>
+                <w:sz w:val="20"/>
+              </w:rPr>
+            </w:pPr>
+            <w:r>
+              <w:rPr>
+                <w:sz w:val="20"/>
+              </w:rPr>
               <w:t>—</w:t>
             </w:r>
           </w:p>
@@ -1194,7 +1224,15 @@
             <w:tcW w:w="2551" w:type="dxa"/>
           </w:tcPr>
           <w:p>
-            <w:r>
+            <w:pPr>
+              <w:rPr>
+                <w:sz w:val="20"/>
+              </w:rPr>
+            </w:pPr>
+            <w:r>
+              <w:rPr>
+                <w:sz w:val="20"/>
+              </w:rPr>
               <w:t>kontinensek</w:t>
             </w:r>
           </w:p>
@@ -1204,7 +1242,15 @@
             <w:tcW w:w="1247" w:type="dxa"/>
           </w:tcPr>
           <w:p>
-            <w:r>
+            <w:pPr>
+              <w:rPr>
+                <w:sz w:val="20"/>
+              </w:rPr>
+            </w:pPr>
+            <w:r>
+              <w:rPr>
+                <w:sz w:val="20"/>
+              </w:rPr>
               <w:t>2</w:t>
             </w:r>
           </w:p>
@@ -1214,7 +1260,15 @@
             <w:tcW w:w="5556" w:type="dxa"/>
           </w:tcPr>
           <w:p>
-            <w:r>
+            <w:pPr>
+              <w:rPr>
+                <w:sz w:val="20"/>
+              </w:rPr>
+            </w:pPr>
+            <w:r>
+              <w:rPr>
+                <w:sz w:val="20"/>
+              </w:rPr>
               <w:t>—</w:t>
             </w:r>
           </w:p>
@@ -1226,7 +1280,15 @@
             <w:tcW w:w="2551" w:type="dxa"/>
           </w:tcPr>
           <w:p>
-            <w:r>
+            <w:pPr>
+              <w:rPr>
+                <w:sz w:val="20"/>
+              </w:rPr>
+            </w:pPr>
+            <w:r>
+              <w:rPr>
+                <w:sz w:val="20"/>
+              </w:rPr>
               <w:t>meretek</w:t>
             </w:r>
           </w:p>
@@ -1236,7 +1298,15 @@
             <w:tcW w:w="1247" w:type="dxa"/>
           </w:tcPr>
           <w:p>
-            <w:r>
+            <w:pPr>
+              <w:rPr>
+                <w:sz w:val="20"/>
+              </w:rPr>
+            </w:pPr>
+            <w:r>
+              <w:rPr>
+                <w:sz w:val="20"/>
+              </w:rPr>
               <w:t>3</w:t>
             </w:r>
           </w:p>
@@ -1246,7 +1316,15 @@
             <w:tcW w:w="5556" w:type="dxa"/>
           </w:tcPr>
           <w:p>
-            <w:r>
+            <w:pPr>
+              <w:rPr>
+                <w:sz w:val="20"/>
+              </w:rPr>
+            </w:pPr>
+            <w:r>
+              <w:rPr>
+                <w:sz w:val="20"/>
+              </w:rPr>
               <w:t>—</w:t>
             </w:r>
           </w:p>
@@ -1258,7 +1336,15 @@
             <w:tcW w:w="2551" w:type="dxa"/>
           </w:tcPr>
           <w:p>
-            <w:r>
+            <w:pPr>
+              <w:rPr>
+                <w:sz w:val="20"/>
+              </w:rPr>
+            </w:pPr>
+            <w:r>
+              <w:rPr>
+                <w:sz w:val="20"/>
+              </w:rPr>
               <w:t>orszagok</w:t>
             </w:r>
           </w:p>
@@ -1268,7 +1354,15 @@
             <w:tcW w:w="1247" w:type="dxa"/>
           </w:tcPr>
           <w:p>
-            <w:r>
+            <w:pPr>
+              <w:rPr>
+                <w:sz w:val="20"/>
+              </w:rPr>
+            </w:pPr>
+            <w:r>
+              <w:rPr>
+                <w:sz w:val="20"/>
+              </w:rPr>
               <w:t>3</w:t>
             </w:r>
           </w:p>
@@ -1278,7 +1372,15 @@
             <w:tcW w:w="5556" w:type="dxa"/>
           </w:tcPr>
           <w:p>
-            <w:r>
+            <w:pPr>
+              <w:rPr>
+                <w:sz w:val="20"/>
+              </w:rPr>
+            </w:pPr>
+            <w:r>
+              <w:rPr>
+                <w:sz w:val="20"/>
+              </w:rPr>
               <w:t>kont_Id→kontinensek.id</w:t>
             </w:r>
           </w:p>
@@ -1290,7 +1392,15 @@
             <w:tcW w:w="2551" w:type="dxa"/>
           </w:tcPr>
           <w:p>
-            <w:r>
+            <w:pPr>
+              <w:rPr>
+                <w:sz w:val="20"/>
+              </w:rPr>
+            </w:pPr>
+            <w:r>
+              <w:rPr>
+                <w:sz w:val="20"/>
+              </w:rPr>
               <w:t>rendeles_reszletek</w:t>
             </w:r>
           </w:p>
@@ -1300,7 +1410,15 @@
             <w:tcW w:w="1247" w:type="dxa"/>
           </w:tcPr>
           <w:p>
-            <w:r>
+            <w:pPr>
+              <w:rPr>
+                <w:sz w:val="20"/>
+              </w:rPr>
+            </w:pPr>
+            <w:r>
+              <w:rPr>
+                <w:sz w:val="20"/>
+              </w:rPr>
               <w:t>7</w:t>
             </w:r>
           </w:p>
@@ -1310,7 +1428,15 @@
             <w:tcW w:w="5556" w:type="dxa"/>
           </w:tcPr>
           <w:p>
-            <w:r>
+            <w:pPr>
+              <w:rPr>
+                <w:sz w:val="20"/>
+              </w:rPr>
+            </w:pPr>
+            <w:r>
+              <w:rPr>
+                <w:sz w:val="20"/>
+              </w:rPr>
               <w:t>szamla_id→szamla.szamla_id, zaszlo_id→zaszlok.id</w:t>
             </w:r>
           </w:p>
@@ -1322,7 +1448,15 @@
             <w:tcW w:w="2551" w:type="dxa"/>
           </w:tcPr>
           <w:p>
-            <w:r>
+            <w:pPr>
+              <w:rPr>
+                <w:sz w:val="20"/>
+              </w:rPr>
+            </w:pPr>
+            <w:r>
+              <w:rPr>
+                <w:sz w:val="20"/>
+              </w:rPr>
               <w:t>szamla</w:t>
             </w:r>
           </w:p>
@@ -1332,7 +1466,15 @@
             <w:tcW w:w="1247" w:type="dxa"/>
           </w:tcPr>
           <w:p>
-            <w:r>
+            <w:pPr>
+              <w:rPr>
+                <w:sz w:val="20"/>
+              </w:rPr>
+            </w:pPr>
+            <w:r>
+              <w:rPr>
+                <w:sz w:val="20"/>
+              </w:rPr>
               <w:t>7</w:t>
             </w:r>
           </w:p>
@@ -1342,7 +1484,15 @@
             <w:tcW w:w="5556" w:type="dxa"/>
           </w:tcPr>
           <w:p>
-            <w:r>
+            <w:pPr>
+              <w:rPr>
+                <w:sz w:val="20"/>
+              </w:rPr>
+            </w:pPr>
+            <w:r>
+              <w:rPr>
+                <w:sz w:val="20"/>
+              </w:rPr>
               <w:t>fizetesi_mod→fizetesi_mod.id, vevo_id→vevo.id</w:t>
             </w:r>
           </w:p>
@@ -1354,7 +1504,15 @@
             <w:tcW w:w="2551" w:type="dxa"/>
           </w:tcPr>
           <w:p>
-            <w:r>
+            <w:pPr>
+              <w:rPr>
+                <w:sz w:val="20"/>
+              </w:rPr>
+            </w:pPr>
+            <w:r>
+              <w:rPr>
+                <w:sz w:val="20"/>
+              </w:rPr>
               <w:t>vevo</w:t>
             </w:r>
           </w:p>
@@ -1364,7 +1522,15 @@
             <w:tcW w:w="1247" w:type="dxa"/>
           </w:tcPr>
           <w:p>
-            <w:r>
+            <w:pPr>
+              <w:rPr>
+                <w:sz w:val="20"/>
+              </w:rPr>
+            </w:pPr>
+            <w:r>
+              <w:rPr>
+                <w:sz w:val="20"/>
+              </w:rPr>
               <w:t>11</w:t>
             </w:r>
           </w:p>
@@ -1374,7 +1540,15 @@
             <w:tcW w:w="5556" w:type="dxa"/>
           </w:tcPr>
           <w:p>
-            <w:r>
+            <w:pPr>
+              <w:rPr>
+                <w:sz w:val="20"/>
+              </w:rPr>
+            </w:pPr>
+            <w:r>
+              <w:rPr>
+                <w:sz w:val="20"/>
+              </w:rPr>
               <w:t>—</w:t>
             </w:r>
           </w:p>
@@ -1386,8 +1560,15 @@
             <w:tcW w:w="2551" w:type="dxa"/>
           </w:tcPr>
           <w:p>
-            <w:r>
-              <w:lastRenderedPageBreak/>
+            <w:pPr>
+              <w:rPr>
+                <w:sz w:val="20"/>
+              </w:rPr>
+            </w:pPr>
+            <w:r>
+              <w:rPr>
+                <w:sz w:val="20"/>
+              </w:rPr>
               <w:t>zaszlok</w:t>
             </w:r>
           </w:p>
@@ -1397,7 +1578,15 @@
             <w:tcW w:w="1247" w:type="dxa"/>
           </w:tcPr>
           <w:p>
-            <w:r>
+            <w:pPr>
+              <w:rPr>
+                <w:sz w:val="20"/>
+              </w:rPr>
+            </w:pPr>
+            <w:r>
+              <w:rPr>
+                <w:sz w:val="20"/>
+              </w:rPr>
               <w:t>4</w:t>
             </w:r>
           </w:p>
@@ -1407,7 +1596,15 @@
             <w:tcW w:w="5556" w:type="dxa"/>
           </w:tcPr>
           <w:p>
-            <w:r>
+            <w:pPr>
+              <w:rPr>
+                <w:sz w:val="20"/>
+              </w:rPr>
+            </w:pPr>
+            <w:r>
+              <w:rPr>
+                <w:sz w:val="20"/>
+              </w:rPr>
               <w:t>anyag→anyagok.id, meret→meretek.id, orszagId→orszagok.id</w:t>
             </w:r>
           </w:p>
@@ -1420,6 +1617,7 @@
         <w:pStyle w:val="Cmsor2"/>
       </w:pPr>
       <w:r>
+        <w:lastRenderedPageBreak/>
         <w:t>5.3 Táblák részletezése</w:t>
       </w:r>
     </w:p>
@@ -2070,6 +2268,7 @@
           </w:tcPr>
           <w:p>
             <w:r>
+              <w:lastRenderedPageBreak/>
               <w:t>zaszlo_id</w:t>
             </w:r>
           </w:p>
@@ -2407,9 +2606,15 @@
             <w:vAlign w:val="center"/>
           </w:tcPr>
           <w:p>
+            <w:pPr>
+              <w:rPr>
+                <w:sz w:val="18"/>
+              </w:rPr>
+            </w:pPr>
             <w:r>
               <w:rPr>
                 <w:b/>
+                <w:sz w:val="18"/>
               </w:rPr>
               <w:t>Oszlop</w:t>
             </w:r>
@@ -2422,9 +2627,15 @@
             <w:vAlign w:val="center"/>
           </w:tcPr>
           <w:p>
+            <w:pPr>
+              <w:rPr>
+                <w:sz w:val="18"/>
+              </w:rPr>
+            </w:pPr>
             <w:r>
               <w:rPr>
                 <w:b/>
+                <w:sz w:val="18"/>
               </w:rPr>
               <w:t>Típus / megkötés</w:t>
             </w:r>
@@ -2437,7 +2648,15 @@
             <w:tcW w:w="2551" w:type="dxa"/>
           </w:tcPr>
           <w:p>
-            <w:r>
+            <w:pPr>
+              <w:rPr>
+                <w:sz w:val="18"/>
+              </w:rPr>
+            </w:pPr>
+            <w:r>
+              <w:rPr>
+                <w:sz w:val="18"/>
+              </w:rPr>
               <w:t>id</w:t>
             </w:r>
           </w:p>
@@ -2447,7 +2666,15 @@
             <w:tcW w:w="6803" w:type="dxa"/>
           </w:tcPr>
           <w:p>
-            <w:r>
+            <w:pPr>
+              <w:rPr>
+                <w:sz w:val="18"/>
+              </w:rPr>
+            </w:pPr>
+            <w:r>
+              <w:rPr>
+                <w:sz w:val="18"/>
+              </w:rPr>
               <w:t>int NOT NULL AUTO_INCREMENT</w:t>
             </w:r>
           </w:p>
@@ -2459,7 +2686,15 @@
             <w:tcW w:w="2551" w:type="dxa"/>
           </w:tcPr>
           <w:p>
-            <w:r>
+            <w:pPr>
+              <w:rPr>
+                <w:sz w:val="18"/>
+              </w:rPr>
+            </w:pPr>
+            <w:r>
+              <w:rPr>
+                <w:sz w:val="18"/>
+              </w:rPr>
               <w:t>nev</w:t>
             </w:r>
           </w:p>
@@ -2469,7 +2704,15 @@
             <w:tcW w:w="6803" w:type="dxa"/>
           </w:tcPr>
           <w:p>
-            <w:r>
+            <w:pPr>
+              <w:rPr>
+                <w:sz w:val="18"/>
+              </w:rPr>
+            </w:pPr>
+            <w:r>
+              <w:rPr>
+                <w:sz w:val="18"/>
+              </w:rPr>
               <w:t>varchar(100) COLLATE utf8mb4_hungarian_ci NOT NULL</w:t>
             </w:r>
           </w:p>
@@ -2481,7 +2724,15 @@
             <w:tcW w:w="2551" w:type="dxa"/>
           </w:tcPr>
           <w:p>
-            <w:r>
+            <w:pPr>
+              <w:rPr>
+                <w:sz w:val="18"/>
+              </w:rPr>
+            </w:pPr>
+            <w:r>
+              <w:rPr>
+                <w:sz w:val="18"/>
+              </w:rPr>
               <w:t>lakcim</w:t>
             </w:r>
           </w:p>
@@ -2491,7 +2742,15 @@
             <w:tcW w:w="6803" w:type="dxa"/>
           </w:tcPr>
           <w:p>
-            <w:r>
+            <w:pPr>
+              <w:rPr>
+                <w:sz w:val="18"/>
+              </w:rPr>
+            </w:pPr>
+            <w:r>
+              <w:rPr>
+                <w:sz w:val="18"/>
+              </w:rPr>
               <w:t>varchar(150) COLLATE utf8mb4_hungarian_ci DEFAULT NULL</w:t>
             </w:r>
           </w:p>
@@ -2503,7 +2762,15 @@
             <w:tcW w:w="2551" w:type="dxa"/>
           </w:tcPr>
           <w:p>
-            <w:r>
+            <w:pPr>
+              <w:rPr>
+                <w:sz w:val="18"/>
+              </w:rPr>
+            </w:pPr>
+            <w:r>
+              <w:rPr>
+                <w:sz w:val="18"/>
+              </w:rPr>
               <w:t>adoszam</w:t>
             </w:r>
           </w:p>
@@ -2513,7 +2780,15 @@
             <w:tcW w:w="6803" w:type="dxa"/>
           </w:tcPr>
           <w:p>
-            <w:r>
+            <w:pPr>
+              <w:rPr>
+                <w:sz w:val="18"/>
+              </w:rPr>
+            </w:pPr>
+            <w:r>
+              <w:rPr>
+                <w:sz w:val="18"/>
+              </w:rPr>
               <w:t>varchar(50) COLLATE utf8mb4_hungarian_ci DEFAULT NULL</w:t>
             </w:r>
           </w:p>
@@ -2525,7 +2800,15 @@
             <w:tcW w:w="2551" w:type="dxa"/>
           </w:tcPr>
           <w:p>
-            <w:r>
+            <w:pPr>
+              <w:rPr>
+                <w:sz w:val="18"/>
+              </w:rPr>
+            </w:pPr>
+            <w:r>
+              <w:rPr>
+                <w:sz w:val="18"/>
+              </w:rPr>
               <w:t>jelszo</w:t>
             </w:r>
           </w:p>
@@ -2535,7 +2818,15 @@
             <w:tcW w:w="6803" w:type="dxa"/>
           </w:tcPr>
           <w:p>
-            <w:r>
+            <w:pPr>
+              <w:rPr>
+                <w:sz w:val="18"/>
+              </w:rPr>
+            </w:pPr>
+            <w:r>
+              <w:rPr>
+                <w:sz w:val="18"/>
+              </w:rPr>
               <w:t>varchar(255) COLLATE utf8mb4_hungarian_ci NOT NULL</w:t>
             </w:r>
           </w:p>
@@ -2547,7 +2838,15 @@
             <w:tcW w:w="2551" w:type="dxa"/>
           </w:tcPr>
           <w:p>
-            <w:r>
+            <w:pPr>
+              <w:rPr>
+                <w:sz w:val="18"/>
+              </w:rPr>
+            </w:pPr>
+            <w:r>
+              <w:rPr>
+                <w:sz w:val="18"/>
+              </w:rPr>
               <w:t>jogosultsag</w:t>
             </w:r>
           </w:p>
@@ -2557,7 +2856,15 @@
             <w:tcW w:w="6803" w:type="dxa"/>
           </w:tcPr>
           <w:p>
-            <w:r>
+            <w:pPr>
+              <w:rPr>
+                <w:sz w:val="18"/>
+              </w:rPr>
+            </w:pPr>
+            <w:r>
+              <w:rPr>
+                <w:sz w:val="18"/>
+              </w:rPr>
               <w:t>varchar(50) COLLATE utf8mb4_hungarian_ci NOT NULL DEFAULT 'user'</w:t>
             </w:r>
           </w:p>
@@ -2569,7 +2876,15 @@
             <w:tcW w:w="2551" w:type="dxa"/>
           </w:tcPr>
           <w:p>
-            <w:r>
+            <w:pPr>
+              <w:rPr>
+                <w:sz w:val="18"/>
+              </w:rPr>
+            </w:pPr>
+            <w:r>
+              <w:rPr>
+                <w:sz w:val="18"/>
+              </w:rPr>
               <w:t>email</w:t>
             </w:r>
           </w:p>
@@ -2579,7 +2894,15 @@
             <w:tcW w:w="6803" w:type="dxa"/>
           </w:tcPr>
           <w:p>
-            <w:r>
+            <w:pPr>
+              <w:rPr>
+                <w:sz w:val="18"/>
+              </w:rPr>
+            </w:pPr>
+            <w:r>
+              <w:rPr>
+                <w:sz w:val="18"/>
+              </w:rPr>
               <w:t>varchar(100) COLLATE utf8mb4_hungarian_ci NOT NULL</w:t>
             </w:r>
           </w:p>
@@ -2591,7 +2914,15 @@
             <w:tcW w:w="2551" w:type="dxa"/>
           </w:tcPr>
           <w:p>
-            <w:r>
+            <w:pPr>
+              <w:rPr>
+                <w:sz w:val="18"/>
+              </w:rPr>
+            </w:pPr>
+            <w:r>
+              <w:rPr>
+                <w:sz w:val="18"/>
+              </w:rPr>
               <w:t>telefonszam</w:t>
             </w:r>
           </w:p>
@@ -2601,7 +2932,15 @@
             <w:tcW w:w="6803" w:type="dxa"/>
           </w:tcPr>
           <w:p>
-            <w:r>
+            <w:pPr>
+              <w:rPr>
+                <w:sz w:val="18"/>
+              </w:rPr>
+            </w:pPr>
+            <w:r>
+              <w:rPr>
+                <w:sz w:val="18"/>
+              </w:rPr>
               <w:t>varchar(255) COLLATE utf8mb4_hungarian_ci DEFAULT NULL</w:t>
             </w:r>
           </w:p>
@@ -2613,8 +2952,15 @@
             <w:tcW w:w="2551" w:type="dxa"/>
           </w:tcPr>
           <w:p>
-            <w:r>
-              <w:lastRenderedPageBreak/>
+            <w:pPr>
+              <w:rPr>
+                <w:sz w:val="18"/>
+              </w:rPr>
+            </w:pPr>
+            <w:r>
+              <w:rPr>
+                <w:sz w:val="18"/>
+              </w:rPr>
               <w:t>iranyitoszam</w:t>
             </w:r>
           </w:p>
@@ -2624,7 +2970,15 @@
             <w:tcW w:w="6803" w:type="dxa"/>
           </w:tcPr>
           <w:p>
-            <w:r>
+            <w:pPr>
+              <w:rPr>
+                <w:sz w:val="18"/>
+              </w:rPr>
+            </w:pPr>
+            <w:r>
+              <w:rPr>
+                <w:sz w:val="18"/>
+              </w:rPr>
               <w:t>int DEFAULT NULL</w:t>
             </w:r>
           </w:p>
@@ -2636,7 +2990,15 @@
             <w:tcW w:w="2551" w:type="dxa"/>
           </w:tcPr>
           <w:p>
-            <w:r>
+            <w:pPr>
+              <w:rPr>
+                <w:sz w:val="18"/>
+              </w:rPr>
+            </w:pPr>
+            <w:r>
+              <w:rPr>
+                <w:sz w:val="18"/>
+              </w:rPr>
               <w:t>varos</w:t>
             </w:r>
           </w:p>
@@ -2646,7 +3008,15 @@
             <w:tcW w:w="6803" w:type="dxa"/>
           </w:tcPr>
           <w:p>
-            <w:r>
+            <w:pPr>
+              <w:rPr>
+                <w:sz w:val="18"/>
+              </w:rPr>
+            </w:pPr>
+            <w:r>
+              <w:rPr>
+                <w:sz w:val="18"/>
+              </w:rPr>
               <w:t>varchar(255) COLLATE utf8mb4_hungarian_ci DEFAULT NULL</w:t>
             </w:r>
           </w:p>
@@ -2658,7 +3028,15 @@
             <w:tcW w:w="2551" w:type="dxa"/>
           </w:tcPr>
           <w:p>
-            <w:r>
+            <w:pPr>
+              <w:rPr>
+                <w:sz w:val="18"/>
+              </w:rPr>
+            </w:pPr>
+            <w:r>
+              <w:rPr>
+                <w:sz w:val="18"/>
+              </w:rPr>
               <w:t>utca</w:t>
             </w:r>
           </w:p>
@@ -2668,19 +3046,39 @@
             <w:tcW w:w="6803" w:type="dxa"/>
           </w:tcPr>
           <w:p>
-            <w:r>
+            <w:pPr>
+              <w:rPr>
+                <w:sz w:val="18"/>
+              </w:rPr>
+            </w:pPr>
+            <w:r>
+              <w:rPr>
+                <w:sz w:val="18"/>
+              </w:rPr>
               <w:t>varchar(255) COLLATE utf8mb4_hungarian_ci DEFAULT NULL</w:t>
             </w:r>
           </w:p>
         </w:tc>
       </w:tr>
     </w:tbl>
-    <w:p/>
+    <w:p>
+      <w:pPr>
+        <w:rPr>
+          <w:sz w:val="18"/>
+        </w:rPr>
+      </w:pPr>
+    </w:p>
     <w:p>
       <w:pPr>
         <w:pStyle w:val="Cmsor3"/>
-      </w:pPr>
-      <w:r>
+        <w:rPr>
+          <w:sz w:val="20"/>
+        </w:rPr>
+      </w:pPr>
+      <w:r>
+        <w:rPr>
+          <w:sz w:val="20"/>
+        </w:rPr>
         <w:t>zaszlok</w:t>
       </w:r>
     </w:p>
@@ -2702,9 +3100,15 @@
             <w:vAlign w:val="center"/>
           </w:tcPr>
           <w:p>
+            <w:pPr>
+              <w:rPr>
+                <w:sz w:val="18"/>
+              </w:rPr>
+            </w:pPr>
             <w:r>
               <w:rPr>
                 <w:b/>
+                <w:sz w:val="18"/>
               </w:rPr>
               <w:t>Oszlop</w:t>
             </w:r>
@@ -2717,9 +3121,15 @@
             <w:vAlign w:val="center"/>
           </w:tcPr>
           <w:p>
+            <w:pPr>
+              <w:rPr>
+                <w:sz w:val="18"/>
+              </w:rPr>
+            </w:pPr>
             <w:r>
               <w:rPr>
                 <w:b/>
+                <w:sz w:val="18"/>
               </w:rPr>
               <w:t>Típus / megkötés</w:t>
             </w:r>
@@ -2732,7 +3142,15 @@
             <w:tcW w:w="2551" w:type="dxa"/>
           </w:tcPr>
           <w:p>
-            <w:r>
+            <w:pPr>
+              <w:rPr>
+                <w:sz w:val="18"/>
+              </w:rPr>
+            </w:pPr>
+            <w:r>
+              <w:rPr>
+                <w:sz w:val="18"/>
+              </w:rPr>
               <w:t>id</w:t>
             </w:r>
           </w:p>
@@ -2742,7 +3160,15 @@
             <w:tcW w:w="6803" w:type="dxa"/>
           </w:tcPr>
           <w:p>
-            <w:r>
+            <w:pPr>
+              <w:rPr>
+                <w:sz w:val="18"/>
+              </w:rPr>
+            </w:pPr>
+            <w:r>
+              <w:rPr>
+                <w:sz w:val="18"/>
+              </w:rPr>
               <w:t>int NOT NULL AUTO_INCREMENT</w:t>
             </w:r>
           </w:p>
@@ -2754,7 +3180,15 @@
             <w:tcW w:w="2551" w:type="dxa"/>
           </w:tcPr>
           <w:p>
-            <w:r>
+            <w:pPr>
+              <w:rPr>
+                <w:sz w:val="18"/>
+              </w:rPr>
+            </w:pPr>
+            <w:r>
+              <w:rPr>
+                <w:sz w:val="18"/>
+              </w:rPr>
               <w:t>meret</w:t>
             </w:r>
           </w:p>
@@ -2764,7 +3198,15 @@
             <w:tcW w:w="6803" w:type="dxa"/>
           </w:tcPr>
           <w:p>
-            <w:r>
+            <w:pPr>
+              <w:rPr>
+                <w:sz w:val="18"/>
+              </w:rPr>
+            </w:pPr>
+            <w:r>
+              <w:rPr>
+                <w:sz w:val="18"/>
+              </w:rPr>
               <w:t>int NOT NULL</w:t>
             </w:r>
           </w:p>
@@ -2776,7 +3218,15 @@
             <w:tcW w:w="2551" w:type="dxa"/>
           </w:tcPr>
           <w:p>
-            <w:r>
+            <w:pPr>
+              <w:rPr>
+                <w:sz w:val="18"/>
+              </w:rPr>
+            </w:pPr>
+            <w:r>
+              <w:rPr>
+                <w:sz w:val="18"/>
+              </w:rPr>
               <w:t>anyag</w:t>
             </w:r>
           </w:p>
@@ -2786,7 +3236,15 @@
             <w:tcW w:w="6803" w:type="dxa"/>
           </w:tcPr>
           <w:p>
-            <w:r>
+            <w:pPr>
+              <w:rPr>
+                <w:sz w:val="18"/>
+              </w:rPr>
+            </w:pPr>
+            <w:r>
+              <w:rPr>
+                <w:sz w:val="18"/>
+              </w:rPr>
               <w:t>int NOT NULL</w:t>
             </w:r>
           </w:p>
@@ -2798,7 +3256,15 @@
             <w:tcW w:w="2551" w:type="dxa"/>
           </w:tcPr>
           <w:p>
-            <w:r>
+            <w:pPr>
+              <w:rPr>
+                <w:sz w:val="18"/>
+              </w:rPr>
+            </w:pPr>
+            <w:r>
+              <w:rPr>
+                <w:sz w:val="18"/>
+              </w:rPr>
               <w:t>orszagId</w:t>
             </w:r>
           </w:p>
@@ -2808,7 +3274,15 @@
             <w:tcW w:w="6803" w:type="dxa"/>
           </w:tcPr>
           <w:p>
-            <w:r>
+            <w:pPr>
+              <w:rPr>
+                <w:sz w:val="18"/>
+              </w:rPr>
+            </w:pPr>
+            <w:r>
+              <w:rPr>
+                <w:sz w:val="18"/>
+              </w:rPr>
               <w:t>int NOT NULL</w:t>
             </w:r>
           </w:p>
@@ -3093,7 +3567,6 @@
         <w:pStyle w:val="CodeBlock"/>
       </w:pPr>
       <w:r>
-        <w:lastRenderedPageBreak/>
         <w:t xml:space="preserve">  routes/         # /auth, /zaszlok, /szamlak</w:t>
       </w:r>
     </w:p>
@@ -3227,7 +3700,13 @@
           </w:tcPr>
           <w:p>
             <w:r>
-              <w:t>MySQL host (pl. localhost).</w:t>
+              <w:t xml:space="preserve">MySQL host </w:t>
+            </w:r>
+            <w:r>
+              <w:t>(</w:t>
+            </w:r>
+            <w:r>
+              <w:t>localhost).</w:t>
             </w:r>
           </w:p>
         </w:tc>
@@ -3249,7 +3728,18 @@
           </w:tcPr>
           <w:p>
             <w:r>
-              <w:t>MySQL felhasználó.</w:t>
+              <w:t xml:space="preserve">MySQL </w:t>
+            </w:r>
+            <w:proofErr w:type="spellStart"/>
+            <w:r>
+              <w:t>felhasználó</w:t>
+            </w:r>
+            <w:proofErr w:type="spellEnd"/>
+            <w:r>
+              <w:t>.</w:t>
+            </w:r>
+            <w:r>
+              <w:t xml:space="preserve"> (root)</w:t>
             </w:r>
           </w:p>
         </w:tc>
@@ -3271,7 +3761,18 @@
           </w:tcPr>
           <w:p>
             <w:r>
-              <w:t>MySQL jelszó.</w:t>
+              <w:t xml:space="preserve">MySQL </w:t>
+            </w:r>
+            <w:proofErr w:type="spellStart"/>
+            <w:r>
+              <w:t>jelszó</w:t>
+            </w:r>
+            <w:proofErr w:type="spellEnd"/>
+            <w:r>
+              <w:t>.</w:t>
+            </w:r>
+            <w:r>
+              <w:t xml:space="preserve"> (root)</w:t>
             </w:r>
           </w:p>
         </w:tc>
@@ -3283,6 +3784,7 @@
           </w:tcPr>
           <w:p>
             <w:r>
+              <w:lastRenderedPageBreak/>
               <w:t>DB_NAME</w:t>
             </w:r>
           </w:p>
@@ -3482,10 +3984,26 @@
         <w:pStyle w:val="Listaszerbekezds"/>
       </w:pPr>
       <w:r>
-        <w:t xml:space="preserve">• Role alapú védelem: admin </w:t>
+        <w:t xml:space="preserve">• Role </w:t>
       </w:r>
       <w:proofErr w:type="spellStart"/>
       <w:r>
+        <w:t>alapú</w:t>
+      </w:r>
+      <w:proofErr w:type="spellEnd"/>
+      <w:r>
+        <w:t xml:space="preserve"> </w:t>
+      </w:r>
+      <w:proofErr w:type="spellStart"/>
+      <w:r>
+        <w:t>védelem</w:t>
+      </w:r>
+      <w:proofErr w:type="spellEnd"/>
+      <w:r>
+        <w:t xml:space="preserve">: admin </w:t>
+      </w:r>
+      <w:proofErr w:type="spellStart"/>
+      <w:r>
         <w:t>végpontokhoz</w:t>
       </w:r>
       <w:proofErr w:type="spellEnd"/>
@@ -3513,15 +4031,12 @@
       <w:pPr>
         <w:pStyle w:val="Listaszerbekezds"/>
       </w:pPr>
-      <w:bookmarkStart w:id="0" w:name="_GoBack"/>
-      <w:bookmarkEnd w:id="0"/>
     </w:p>
     <w:p>
       <w:pPr>
         <w:pStyle w:val="Cmsor2"/>
       </w:pPr>
       <w:r>
-        <w:lastRenderedPageBreak/>
         <w:t xml:space="preserve">6.6 REST API </w:t>
       </w:r>
       <w:proofErr w:type="spellStart"/>
@@ -4107,6 +4622,7 @@
           </w:tcPr>
           <w:p>
             <w:r>
+              <w:lastRenderedPageBreak/>
               <w:t>DELETE</w:t>
             </w:r>
           </w:p>
@@ -4675,7 +5191,6 @@
           </w:tcPr>
           <w:p>
             <w:r>
-              <w:lastRenderedPageBreak/>
               <w:t>PUT</w:t>
             </w:r>
           </w:p>
@@ -5025,7 +5540,23 @@
         <w:pStyle w:val="Note"/>
       </w:pPr>
       <w:r>
-        <w:t>Megjegyzés: a képek mentési útvonala jelenleg fixen a frontend `public/images` mappájára mutat. Production környezetben javasolt környezeti változóval konfigurálhatóvá tenni.</w:t>
+        <w:t xml:space="preserve">Megjegyzés: a képek mentési útvonala jelenleg fixen a frontend `public/images` </w:t>
+      </w:r>
+      <w:proofErr w:type="spellStart"/>
+      <w:r>
+        <w:t>mappájára</w:t>
+      </w:r>
+      <w:proofErr w:type="spellEnd"/>
+      <w:r>
+        <w:t xml:space="preserve"> </w:t>
+      </w:r>
+      <w:proofErr w:type="spellStart"/>
+      <w:r>
+        <w:t>mutat</w:t>
+      </w:r>
+      <w:proofErr w:type="spellEnd"/>
+      <w:r>
+        <w:t>.</w:t>
       </w:r>
     </w:p>
     <w:p>
@@ -5033,6 +5564,7 @@
         <w:pStyle w:val="Cmsor1"/>
       </w:pPr>
       <w:r>
+        <w:lastRenderedPageBreak/>
         <w:t>7. Frontend (React + Vite)</w:t>
       </w:r>
     </w:p>
@@ -5168,7 +5700,6 @@
         <w:pStyle w:val="Cmsor2"/>
       </w:pPr>
       <w:r>
-        <w:lastRenderedPageBreak/>
         <w:t>7.4 API konfiguráció (axios)</w:t>
       </w:r>
     </w:p>
@@ -5236,7 +5767,7 @@
           </w:tcPr>
           <w:p>
             <w:r>
-              <w:t>Backend base URL (pl. http://localhost:8080). Opcionális.</w:t>
+              <w:t xml:space="preserve">Backend base URL (pl. http://localhost:8080). </w:t>
             </w:r>
           </w:p>
         </w:tc>
@@ -5258,7 +5789,7 @@
           </w:tcPr>
           <w:p>
             <w:r>
-              <w:t>Backend port (alap: 8080). Opcionális.</w:t>
+              <w:t xml:space="preserve">Backend port (alap: 8080). </w:t>
             </w:r>
           </w:p>
         </w:tc>
@@ -5358,6 +5889,7 @@
         <w:pStyle w:val="Listaszerbekezds"/>
       </w:pPr>
       <w:r>
+        <w:lastRenderedPageBreak/>
         <w:t>• /rolunk</w:t>
       </w:r>
     </w:p>
@@ -5529,7 +6061,6 @@
         <w:pStyle w:val="Cmsor2"/>
       </w:pPr>
       <w:r>
-        <w:lastRenderedPageBreak/>
         <w:t>7.10 Build</w:t>
       </w:r>
     </w:p>
@@ -5548,15 +6079,6 @@
       </w:pPr>
       <w:r>
         <w:t>npm run build</w:t>
-      </w:r>
-    </w:p>
-    <w:p>
-      <w:pPr>
-        <w:pStyle w:val="CodeBlock"/>
-        <w:spacing w:after="160"/>
-      </w:pPr>
-      <w:r>
-        <w:t># output: dist/</w:t>
       </w:r>
     </w:p>
     <w:p>
@@ -5683,6 +6205,7 @@
         <w:pStyle w:val="Cmsor2"/>
       </w:pPr>
       <w:r>
+        <w:lastRenderedPageBreak/>
         <w:t>8.3 UX kiegészítések</w:t>
       </w:r>
     </w:p>
@@ -5731,7 +6254,12 @@
         <w:pStyle w:val="Cmsor1"/>
       </w:pPr>
       <w:r>
-        <w:t>9. Biztonság és minőség</w:t>
+        <w:t xml:space="preserve">9. Biztonság </w:t>
+      </w:r>
+      <w:bookmarkStart w:id="0" w:name="_GoBack"/>
+      <w:bookmarkEnd w:id="0"/>
+      <w:r>
+        <w:t>és minőség</w:t>
       </w:r>
     </w:p>
     <w:p>
@@ -5803,7 +6331,6 @@
         <w:pStyle w:val="Listaszerbekezds"/>
       </w:pPr>
       <w:r>
-        <w:lastRenderedPageBreak/>
         <w:t>• Újrafelhasználhatóság: Kosár context, közös axios konfiguráció.</w:t>
       </w:r>
     </w:p>
@@ -6708,10 +7235,6 @@
     <w:lsdException w:name="Book Title" w:uiPriority="33" w:qFormat="1"/>
     <w:lsdException w:name="Bibliography" w:semiHidden="1" w:uiPriority="37" w:unhideWhenUsed="1"/>
     <w:lsdException w:name="TOC Heading" w:semiHidden="1" w:uiPriority="39" w:unhideWhenUsed="1" w:qFormat="1"/>
-    <w:lsdException w:name="Grid Table Light" w:semiHidden="1" w:unhideWhenUsed="1"/>
-    <w:lsdException w:name="Grid Table 1 Light" w:semiHidden="1" w:unhideWhenUsed="1"/>
-    <w:lsdException w:name="Grid Table 2" w:semiHidden="1" w:unhideWhenUsed="1"/>
-    <w:lsdException w:name="Grid Table 3" w:semiHidden="1" w:unhideWhenUsed="1"/>
     <w:lsdException w:name="Grid Table 4" w:uiPriority="49"/>
     <w:lsdException w:name="Grid Table 5 Dark" w:uiPriority="50"/>
     <w:lsdException w:name="Grid Table 6 Colorful" w:uiPriority="51"/>
@@ -18194,7 +18717,7 @@
 </file>
 
 <file path=customXml/itemProps1.xml><?xml version="1.0" encoding="utf-8"?>
-<ds:datastoreItem xmlns:ds="http://schemas.openxmlformats.org/officeDocument/2006/customXml" ds:itemID="{BF2C4E57-D545-4F92-AF63-3EE7F46A4855}">
+<ds:datastoreItem xmlns:ds="http://schemas.openxmlformats.org/officeDocument/2006/customXml" ds:itemID="{1B49A4B1-D2C6-4E11-BB17-220E15F04039}">
   <ds:schemaRefs>
     <ds:schemaRef ds:uri="http://schemas.openxmlformats.org/officeDocument/2006/bibliography"/>
   </ds:schemaRefs>

</xml_diff>